<commit_message>
Update general official table typography
</commit_message>
<xml_diff>
--- a/official-word-generator/assets/base-official-template-before-fusion.docx
+++ b/official-word-generator/assets/base-official-template-before-fusion.docx
@@ -12713,6 +12713,20 @@
     <w:uiPriority w:val="14"/>
     <w:qFormat/>
   </w:style>
+  <w:style w:type="paragraph" w:customStyle="1" w:styleId="????">
+    <w:name w:val="????"/>
+    <w:pPr>
+      <w:spacing w:before="0" w:after="0" w:line="240" w:lineRule="auto"/>
+      <w:jc w:val="center"/>
+      <w:ind/>
+    </w:pPr>
+    <w:rPr>
+      <w:rFonts w:ascii="Times New Roman" w:hAnsi="Times New Roman" w:eastAsia="??_GB2312"/>
+      <w:b/>
+      <w:color w:val="000000"/>
+      <w:sz w:val="32"/>
+    </w:rPr>
+  </w:style>
 </w:styles>
 </file>
 

</xml_diff>